<commit_message>
update for word docs
updated sonde sheets and code notes
</commit_message>
<xml_diff>
--- a/Templates/water-quality-analysis/code notes.docx
+++ b/Templates/water-quality-analysis/code notes.docx
@@ -49,6 +49,9 @@
       <w:r>
         <w:t>The formatting was what was most useful for troubleshooting but not for using the code</w:t>
       </w:r>
+      <w:r>
+        <w:t xml:space="preserve">. Needs to have instructions put back in there, I excluded them when I moved chunks over. </w:t>
+      </w:r>
     </w:p>
     <w:p>
       <w:pPr>
@@ -63,15 +66,7 @@
         </w:rPr>
       </w:pPr>
       <w:r>
-        <w:t xml:space="preserve">The blank test code chunk needs to be added into the test code. </w:t>
-      </w:r>
-      <w:proofErr w:type="gramStart"/>
-      <w:r>
-        <w:t>Basically</w:t>
-      </w:r>
-      <w:proofErr w:type="gramEnd"/>
-      <w:r>
-        <w:t xml:space="preserve"> need to use total sample number and get the blanks in. </w:t>
+        <w:t xml:space="preserve">The blank test code chunk needs to be added into the test code. Basically need to use total sample number and get the blanks in. </w:t>
       </w:r>
     </w:p>
     <w:p>
@@ -109,7 +104,6 @@
         <w:t>sample-</w:t>
       </w:r>
       <w:proofErr w:type="spellStart"/>
-      <w:proofErr w:type="gramStart"/>
       <w:r>
         <w:rPr>
           <w:b/>
@@ -120,7 +114,6 @@
         <w:t>helper.R</w:t>
       </w:r>
       <w:proofErr w:type="spellEnd"/>
-      <w:proofErr w:type="gramEnd"/>
     </w:p>
     <w:p>
       <w:pPr>
@@ -248,6 +241,9 @@
         </w:numPr>
       </w:pPr>
       <w:r>
+        <w:rPr>
+          <w:noProof/>
+        </w:rPr>
         <w:drawing>
           <wp:inline distT="0" distB="0" distL="0" distR="0" wp14:anchorId="424E2647" wp14:editId="3E89307B">
             <wp:extent cx="5943600" cy="247015"/>
@@ -305,21 +301,8 @@
           <w:numId w:val="1"/>
         </w:numPr>
       </w:pPr>
-      <w:proofErr w:type="gramStart"/>
-      <w:r>
-        <w:t>Originally had</w:t>
-      </w:r>
-      <w:proofErr w:type="gramEnd"/>
-      <w:r>
-        <w:t xml:space="preserve"> the ISCO known code </w:t>
-      </w:r>
-      <w:proofErr w:type="gramStart"/>
-      <w:r>
-        <w:t>do</w:t>
-      </w:r>
-      <w:proofErr w:type="gramEnd"/>
-      <w:r>
-        <w:t xml:space="preserve"> everything in a single function but split it up for this code. It should be combined still in the old ISCO known code if that’s </w:t>
+      <w:r>
+        <w:t xml:space="preserve">Originally had the ISCO known code do everything in a single function but split it up for this code. It should be combined still in the old ISCO known code if that’s </w:t>
       </w:r>
       <w:proofErr w:type="spellStart"/>
       <w:r>
@@ -362,6 +345,9 @@
         <w:pStyle w:val="ListParagraph"/>
       </w:pPr>
       <w:r>
+        <w:rPr>
+          <w:noProof/>
+        </w:rPr>
         <w:drawing>
           <wp:inline distT="0" distB="0" distL="0" distR="0" wp14:anchorId="6CD294E6" wp14:editId="65A73BAE">
             <wp:extent cx="3238952" cy="1028844"/>
@@ -448,15 +434,7 @@
       </w:pPr>
       <w:r>
         <w:lastRenderedPageBreak/>
-        <w:t xml:space="preserve">The code might already be doing </w:t>
-      </w:r>
-      <w:proofErr w:type="gramStart"/>
-      <w:r>
-        <w:t>this</w:t>
-      </w:r>
-      <w:proofErr w:type="gramEnd"/>
-      <w:r>
-        <w:t xml:space="preserve"> and I was just using it wrong?</w:t>
+        <w:t>The code might already be doing this and I was just using it wrong?</w:t>
       </w:r>
     </w:p>
     <w:p/>
@@ -502,6 +480,9 @@
     </w:p>
     <w:p>
       <w:r>
+        <w:rPr>
+          <w:noProof/>
+        </w:rPr>
         <w:drawing>
           <wp:inline distT="0" distB="0" distL="0" distR="0" wp14:anchorId="7916D310" wp14:editId="32A188A6">
             <wp:extent cx="1609725" cy="232731"/>
@@ -599,6 +580,9 @@
     </w:p>
     <w:p>
       <w:r>
+        <w:rPr>
+          <w:noProof/>
+        </w:rPr>
         <w:drawing>
           <wp:inline distT="0" distB="0" distL="0" distR="0" wp14:anchorId="67B780CF" wp14:editId="7AB48764">
             <wp:extent cx="5943600" cy="487045"/>

</xml_diff>